<commit_message>
ADO#4829 #4830 #4810: chip icon/label/behavior unit — MudIcon, vertical stack, auto-dismiss fix, Bedrock ChipIcon
Co-Authored-By: Claude Sonnet 4.6 <noreply@anthropic.com>
</commit_message>
<xml_diff>
--- a/services/proposal-generator/docs/Integrity_Roofing_WC_Proposal.docx
+++ b/services/proposal-generator/docs/Integrity_Roofing_WC_Proposal.docx
@@ -17,7 +17,7 @@
           <w:color w:val="595959"/>
           <w:sz w:val="18"/>
         </w:rPr>
-        <w:t>Nevada Builders Alliance Insurance Solutions</w:t>
+        <w:t>Nevada Builders Alliance Insurance Solutions, LLC</w:t>
       </w:r>
     </w:p>
     <w:p>
@@ -356,7 +356,7 @@
                 <w:color w:val="595959"/>
                 <w:sz w:val="20"/>
               </w:rPr>
-              <w:t>05/27/2026</w:t>
+              <w:t>06/01/2026</w:t>
             </w:r>
           </w:p>
         </w:tc>
@@ -473,7 +473,7 @@
           <w:color w:val="595959"/>
           <w:sz w:val="20"/>
         </w:rPr>
-        <w:t>On behalf of Nevada Builders Alliance Insurance Services (NBAIS), we are pleased to present this Workers’ Compensation Insurance proposal exclusively for members of the Nevada Builders Alliance (NBA). This proposal has been prepared specifically for your organization and reflects the competitive program rates and enhanced coverage options available through your NBA membership.</w:t>
+        <w:t>On behalf of Nevada Builders Alliance Insurance Solutions (NBAIS), we are pleased to present this Workers’ Compensation Insurance proposal exclusively for members of the Nevada Builders Alliance (NBA). This proposal has been prepared specifically for your organization and reflects the competitive program rates and enhanced coverage options available through your NBA membership.</w:t>
       </w:r>
     </w:p>
     <w:p>
@@ -511,7 +511,7 @@
           <w:color w:val="1F3864"/>
           <w:sz w:val="22"/>
         </w:rPr>
-        <w:t>Program highlights</w:t>
+        <w:t>Program Highlights</w:t>
       </w:r>
     </w:p>
     <w:p>
@@ -983,7 +983,7 @@
                 <w:color w:val="1F3864"/>
                 <w:sz w:val="20"/>
               </w:rPr>
-              <w:t>Base Premium</w:t>
+              <w:t>Estimated Manual Premium</w:t>
             </w:r>
           </w:p>
         </w:tc>
@@ -1010,14 +1010,7 @@
               <w:rPr/>
             </w:pPr>
             <w:r>
-              <w:rPr>
-                <w:rFonts w:ascii="Arial" w:hAnsi="Arial"/>
-                <w:b w:val="false"/>
-                <w:i w:val="false"/>
-                <w:color w:val="595959"/>
-                <w:sz w:val="20"/>
-              </w:rPr>
-              <w:t>$38,762.68</w:t>
+              <w:rPr/>
             </w:r>
           </w:p>
         </w:tc>
@@ -1079,14 +1072,7 @@
               <w:rPr/>
             </w:pPr>
             <w:r>
-              <w:rPr>
-                <w:rFonts w:ascii="Arial" w:hAnsi="Arial"/>
-                <w:b w:val="false"/>
-                <w:i w:val="false"/>
-                <w:color w:val="595959"/>
-                <w:sz w:val="20"/>
-              </w:rPr>
-              <w:t>$38,762.68</w:t>
+              <w:rPr/>
             </w:r>
           </w:p>
         </w:tc>
@@ -1157,7 +1143,7 @@
                 <w:color w:val="595959"/>
                 <w:sz w:val="20"/>
               </w:rPr>
-              <w:t>$3,101.01</w:t>
+              <w:t>$3,521.92</w:t>
             </w:r>
           </w:p>
         </w:tc>
@@ -1290,14 +1276,7 @@
               <w:rPr/>
             </w:pPr>
             <w:r>
-              <w:rPr>
-                <w:rFonts w:ascii="Arial" w:hAnsi="Arial"/>
-                <w:b/>
-                <w:i w:val="false"/>
-                <w:color w:val="1F3864"/>
-                <w:sz w:val="22"/>
-              </w:rPr>
-              <w:t>$41,983.69</w:t>
+              <w:rPr/>
             </w:r>
           </w:p>
         </w:tc>
@@ -1333,7 +1312,7 @@
                 <w:color w:val="1F3864"/>
                 <w:sz w:val="20"/>
               </w:rPr>
-              <w:t>Down Payment Due at Binding (25%): $10,495.92</w:t>
+              <w:t>Down Payment Due at Binding (25%): $11,916.48</w:t>
             </w:r>
             <w:r>
               <w:rPr>
@@ -1382,6 +1361,53 @@
         </w:tc>
       </w:tr>
     </w:tbl>
+    <w:p>
+      <w:pPr>
+        <w:pStyle w:val="Normal"/>
+        <w:pBdr>
+          <w:bottom w:val="single" w:sz="8" w:space="4" w:color="CCCCCC"/>
+        </w:pBdr>
+        <w:spacing w:before="240" w:after="120"/>
+        <w:rPr/>
+      </w:pPr>
+      <w:r>
+        <w:rPr>
+          <w:rFonts w:ascii="Arial" w:hAnsi="Arial"/>
+          <w:b/>
+          <w:i w:val="false"/>
+          <w:color w:val="1F3864"/>
+          <w:sz w:val="22"/>
+        </w:rPr>
+        <w:t>Surplus Contribution</w:t>
+      </w:r>
+    </w:p>
+    <w:p>
+      <w:pPr>
+        <w:pStyle w:val="Normal"/>
+        <w:spacing w:before="80" w:after="80"/>
+        <w:rPr/>
+      </w:pPr>
+      <w:r>
+        <w:rPr>
+          <w:rFonts w:ascii="Arial" w:hAnsi="Arial"/>
+          <w:b w:val="false"/>
+          <w:i w:val="false"/>
+          <w:color w:val="595959"/>
+          <w:sz w:val="20"/>
+        </w:rPr>
+        <w:t xml:space="preserve">As a self-insured group (SIG), BAWNSIG requires a surplus contribution in addition to the estimated premium. This contribution — calculated at 8% of the estimated premium — is a regulatory requirement for SIG participation in Nevada and supports the financial reserves of the group. </w:t>
+      </w:r>
+      <w:r>
+        <w:rPr>
+          <w:rFonts w:ascii="Arial" w:hAnsi="Arial"/>
+          <w:b/>
+          <w:i w:val="false"/>
+          <w:color w:val="595959"/>
+          <w:sz w:val="20"/>
+        </w:rPr>
+        <w:t>It is not a fee retained by NBAIS or your producer.</w:t>
+      </w:r>
+    </w:p>
     <w:p>
       <w:pPr>
         <w:pStyle w:val="Normal"/>
@@ -1703,7 +1729,7 @@
                 <w:color w:val="595959"/>
                 <w:sz w:val="20"/>
               </w:rPr>
-              <w:t>Nevada Builders Alliance Insurance Services (NBAIS) via Higginbotham</w:t>
+              <w:t>Nevada Builders Alliance Insurance Solutions (NBAIS) via Higginbotham</w:t>
             </w:r>
           </w:p>
         </w:tc>
@@ -1928,7 +1954,7 @@
           <w:color w:val="1F3864"/>
           <w:sz w:val="22"/>
         </w:rPr>
-        <w:t>Integrity Roofing</w:t>
+        <w:t>Integrity Roofing, LLC</w:t>
       </w:r>
     </w:p>
     <w:p>
@@ -1937,7 +1963,7 @@
         <w:pBdr>
           <w:bottom w:val="single" w:sz="8" w:space="4" w:color="CCCCCC"/>
         </w:pBdr>
-        <w:spacing w:before="240" w:after="120"/>
+        <w:spacing w:before="240" w:after="200"/>
         <w:rPr/>
       </w:pPr>
       <w:r>
@@ -2315,26 +2341,6 @@
     </w:tbl>
     <w:p>
       <w:pPr>
-        <w:pStyle w:val="Normal"/>
-        <w:pBdr>
-          <w:bottom w:val="single" w:sz="8" w:space="4" w:color="CCCCCC"/>
-        </w:pBdr>
-        <w:spacing w:before="240" w:after="120"/>
-        <w:rPr/>
-      </w:pPr>
-      <w:r>
-        <w:rPr>
-          <w:rFonts w:ascii="Arial" w:hAnsi="Arial"/>
-          <w:b/>
-          <w:i w:val="false"/>
-          <w:color w:val="1F3864"/>
-          <w:sz w:val="22"/>
-        </w:rPr>
-        <w:t>Surplus Contribution</w:t>
-      </w:r>
-    </w:p>
-    <w:p>
-      <w:pPr>
         <w:sectPr>
           <w:headerReference w:type="default" r:id="rId20"/>
           <w:headerReference w:type="first" r:id="rId21"/>
@@ -2349,30 +2355,7 @@
           <w:textDirection w:val="lrTb"/>
           <w:docGrid w:type="default" w:linePitch="360" w:charSpace="0"/>
         </w:sectPr>
-        <w:pStyle w:val="Normal"/>
-        <w:spacing w:before="80" w:after="200"/>
-        <w:rPr/>
       </w:pPr>
-      <w:r>
-        <w:rPr>
-          <w:rFonts w:ascii="Arial" w:hAnsi="Arial"/>
-          <w:b w:val="false"/>
-          <w:i w:val="false"/>
-          <w:color w:val="595959"/>
-          <w:sz w:val="20"/>
-        </w:rPr>
-        <w:t xml:space="preserve">As a self-insured group (SIG), BAWNSIG requires a surplus contribution in addition to the estimated premium. This contribution — calculated at 8% of the estimated premium — is a regulatory requirement for SIG participation in Nevada and supports the financial reserves of the group. </w:t>
-      </w:r>
-      <w:r>
-        <w:rPr>
-          <w:rFonts w:ascii="Arial" w:hAnsi="Arial"/>
-          <w:b/>
-          <w:i w:val="false"/>
-          <w:color w:val="595959"/>
-          <w:sz w:val="20"/>
-        </w:rPr>
-        <w:t>It is not a fee retained by NBAIS or your producer.</w:t>
-      </w:r>
     </w:p>
     <w:tbl>
       <w:tblPr>
@@ -2966,7 +2949,7 @@
                 <w:color w:val="595959"/>
                 <w:sz w:val="20"/>
               </w:rPr>
-              <w:t>Roofing – LLC Member/Manager</w:t>
+              <w:t>Roofing-LLC Member/Manager</w:t>
             </w:r>
           </w:p>
         </w:tc>
@@ -3532,7 +3515,7 @@
                 <w:color w:val="1F3864"/>
                 <w:sz w:val="20"/>
               </w:rPr>
-              <w:t>Total Estimated Premium</w:t>
+              <w:t>Total Estimated Manual Premium</w:t>
             </w:r>
           </w:p>
         </w:tc>
@@ -3555,14 +3538,7 @@
               <w:rPr/>
             </w:pPr>
             <w:r>
-              <w:rPr>
-                <w:rFonts w:ascii="Arial" w:hAnsi="Arial"/>
-                <w:b/>
-                <w:i w:val="false"/>
-                <w:color w:val="1F3864"/>
-                <w:sz w:val="20"/>
-              </w:rPr>
-              <w:t>$41,983.69</w:t>
+              <w:rPr/>
             </w:r>
           </w:p>
         </w:tc>
@@ -3811,7 +3787,7 @@
                 <w:color w:val="595959"/>
                 <w:sz w:val="20"/>
               </w:rPr>
-              <w:t>(775) 555-0100</w:t>
+              <w:t>877-888-4140</w:t>
             </w:r>
           </w:p>
           <w:p>
@@ -3831,7 +3807,7 @@
                 <w:color w:val="595959"/>
                 <w:sz w:val="20"/>
               </w:rPr>
-              <w:t>dslater@nbais.com</w:t>
+              <w:t>dslater@nbainsurancesolutions.com</w:t>
             </w:r>
           </w:p>
         </w:tc>
@@ -3895,7 +3871,7 @@
                 <w:color w:val="595959"/>
                 <w:sz w:val="20"/>
               </w:rPr>
-              <w:t>Nevada Builders Alliance Insurance Services</w:t>
+              <w:t>Nevada Builders Alliance Insurance Solutions</w:t>
             </w:r>
           </w:p>
           <w:p>
@@ -3911,7 +3887,7 @@
                 <w:color w:val="595959"/>
                 <w:sz w:val="20"/>
               </w:rPr>
-              <w:t>1234 Builder’s Way, Reno, NV 89501</w:t>
+              <w:t>603 South Carson Street, Carson City, NV 89701</w:t>
             </w:r>
           </w:p>
           <w:p>
@@ -3931,7 +3907,7 @@
                 <w:color w:val="595959"/>
                 <w:sz w:val="20"/>
               </w:rPr>
-              <w:t>www.nbais.com</w:t>
+              <w:t>nbainsurancesolutions.com</w:t>
             </w:r>
           </w:p>
         </w:tc>
@@ -3972,7 +3948,7 @@
           <w:color w:val="595959"/>
           <w:sz w:val="20"/>
         </w:rPr>
-        <w:t>By signing below, the undersigned acknowledges receipt of this Workers’ Compensation Insurance proposal and authorizes Nevada Builders Alliance Insurance Services (NBAIS) to bind coverage as described herein, effective on the policy period stated above. The undersigned confirms that the payroll, classification codes, and excluded persons listed in this proposal are accurate to the best of their knowledge and understands that final premium is subject to audit. The required initial down payment will be remitted online via the secure payment link provided upon binding.</w:t>
+        <w:t>By signing below, the undersigned acknowledges receipt of this Workers’ Compensation Insurance proposal and authorizes Nevada Builders Alliance Insurance Solutions (NBAIS) to bind coverage as described herein, effective on the policy period stated above. The undersigned confirms that the payroll, classification codes, and excluded persons listed in this proposal are accurate to the best of their knowledge and understands that final premium is subject to audit. The required initial down payment will be remitted online via the secure payment link provided upon binding.</w:t>
       </w:r>
     </w:p>
     <w:tbl>
@@ -4223,7 +4199,7 @@
           <w:color w:val="595959"/>
           <w:sz w:val="17"/>
         </w:rPr>
-        <w:t>This proposal is not a binder or guarantee of coverage. All coverage is subject to underwriting approval, policy terms, conditions, and exclusions. Premium estimates are subject to final payroll audit. NBAIS is an insurance program administered on behalf of Nevada Builders Alliance members.</w:t>
+        <w:t>This proposal is not a binder or guarantee of coverage. All coverage is subject to underwriting approval, policy terms, conditions, and exclusions. Premium estimates are subject to final payroll audit. NBA Insurance Solutions, LLC is an insurance program administered on behalf of Nevada Builders Alliance members.</w:t>
       </w:r>
     </w:p>
     <w:tbl>
@@ -6595,7 +6571,7 @@
                 <w:color w:val="595959"/>
                 <w:sz w:val="18"/>
               </w:rPr>
-              <w:t>HR Services</w:t>
+              <w:t>HR Solutions</w:t>
             </w:r>
           </w:p>
           <w:p>
@@ -6991,7 +6967,7 @@
           <w:color w:val="1F3864"/>
           <w:sz w:val="24"/>
         </w:rPr>
-        <w:t>Retirement Plan Services</w:t>
+        <w:t>Retirement Plan Solutions</w:t>
       </w:r>
     </w:p>
     <w:tbl>

</xml_diff>